<commit_message>
Name SKYLINE, Yardi, AvidXchange, Excel and AI tools in CPA job description
</commit_message>
<xml_diff>
--- a/docs/hiring/Korman-Commercial-CPA-Accountant-Job-Description.docx
+++ b/docs/hiring/Korman-Commercial-CPA-Accountant-Job-Description.docx
@@ -75,7 +75,34 @@
     </w:p>
     <w:p>
       <w:r>
-        <w:t>Behind that portfolio is a group of related legal entities and a central management company — and a lot of accounting that has to stay accurate and current for the whole thing to run smoothly.</w:t>
+        <w:t xml:space="preserve">Behind that portfolio is a group of related legal entities and a central management company — and a lot of accounting that has to stay accurate and current for the whole thing to run smoothly. We run our accounting on </w:t>
+      </w:r>
+      <w:r>
+        <w:rPr>
+          <w:b/>
+        </w:rPr>
+        <w:t>SKYLINE</w:t>
+      </w:r>
+      <w:r>
+        <w:t xml:space="preserve">, automate accounts payable through </w:t>
+      </w:r>
+      <w:r>
+        <w:rPr>
+          <w:b/>
+        </w:rPr>
+        <w:t>AvidXchange</w:t>
+      </w:r>
+      <w:r>
+        <w:t xml:space="preserve">, and live in </w:t>
+      </w:r>
+      <w:r>
+        <w:rPr>
+          <w:b/>
+        </w:rPr>
+        <w:t>Excel</w:t>
+      </w:r>
+      <w:r>
+        <w:t xml:space="preserve"> for analysis and workpapers.</w:t>
       </w:r>
     </w:p>
     <w:p>
@@ -730,6 +757,28 @@
         <w:pStyle w:val="ListBullet"/>
       </w:pPr>
       <w:r>
+        <w:t xml:space="preserve">Use modern tools — including </w:t>
+      </w:r>
+      <w:r>
+        <w:rPr>
+          <w:b/>
+        </w:rPr>
+        <w:t>AI assistants such as Claude or ChatGPT</w:t>
+      </w:r>
+      <w:r>
+        <w:t xml:space="preserve"> —</w:t>
+      </w:r>
+    </w:p>
+    <w:p>
+      <w:r>
+        <w:t xml:space="preserve">  to work faster and reduce manual effort where it makes sense.</w:t>
+      </w:r>
+    </w:p>
+    <w:p>
+      <w:pPr>
+        <w:pStyle w:val="ListBullet"/>
+      </w:pPr>
+      <w:r>
         <w:t>Document procedures so the close process is repeatable and resilient.</w:t>
       </w:r>
     </w:p>
@@ -942,12 +991,61 @@
         <w:t>Strong technology skills</w:t>
       </w:r>
       <w:r>
-        <w:t xml:space="preserve"> — highly proficient with accounting software and</w:t>
+        <w:t xml:space="preserve"> — highly proficient in </w:t>
+      </w:r>
+      <w:r>
+        <w:rPr>
+          <w:b/>
+        </w:rPr>
+        <w:t>Excel</w:t>
+      </w:r>
+      <w:r>
+        <w:t xml:space="preserve"> (pivot tables,</w:t>
       </w:r>
     </w:p>
     <w:p>
       <w:r>
-        <w:t xml:space="preserve">  spreadsheets, and comfortable learning and adopting new systems.</w:t>
+        <w:t xml:space="preserve">  lookups, large-workbook analysis) and comfortable learning and adopting new   systems.</w:t>
+      </w:r>
+    </w:p>
+    <w:p>
+      <w:pPr>
+        <w:pStyle w:val="ListBullet"/>
+      </w:pPr>
+      <w:r>
+        <w:t xml:space="preserve">Experience with </w:t>
+      </w:r>
+      <w:r>
+        <w:rPr>
+          <w:b/>
+        </w:rPr>
+        <w:t>SKYLINE</w:t>
+      </w:r>
+      <w:r>
+        <w:t xml:space="preserve">, </w:t>
+      </w:r>
+      <w:r>
+        <w:rPr>
+          <w:b/>
+        </w:rPr>
+        <w:t>Yardi</w:t>
+      </w:r>
+      <w:r>
+        <w:t>, or a comparable commercial real</w:t>
+      </w:r>
+    </w:p>
+    <w:p>
+      <w:r>
+        <w:t xml:space="preserve">  estate accounting/property management platform, and with an AP automation tool   such as </w:t>
+      </w:r>
+      <w:r>
+        <w:rPr>
+          <w:b/>
+        </w:rPr>
+        <w:t>AvidXchange</w:t>
+      </w:r>
+      <w:r>
+        <w:t>, is strongly preferred.</w:t>
       </w:r>
     </w:p>
     <w:p>
@@ -979,12 +1077,56 @@
         <w:pStyle w:val="ListBullet"/>
       </w:pPr>
       <w:r>
-        <w:t>Experience with commercial real estate / property management platforms (e.g.</w:t>
+        <w:t xml:space="preserve">Direct experience with </w:t>
+      </w:r>
+      <w:r>
+        <w:rPr>
+          <w:b/>
+        </w:rPr>
+        <w:t>SKYLINE</w:t>
+      </w:r>
+      <w:r>
+        <w:t xml:space="preserve">, </w:t>
+      </w:r>
+      <w:r>
+        <w:rPr>
+          <w:b/>
+        </w:rPr>
+        <w:t>Yardi</w:t>
+      </w:r>
+      <w:r>
+        <w:t xml:space="preserve">, and </w:t>
+      </w:r>
+      <w:r>
+        <w:rPr>
+          <w:b/>
+        </w:rPr>
+        <w:t>AvidXchange</w:t>
+      </w:r>
+      <w:r>
+        <w:t>; otherwise</w:t>
       </w:r>
     </w:p>
     <w:p>
       <w:r>
-        <w:t xml:space="preserve">  Yardi, MRI, RealPage, AppFolio, or similar).</w:t>
+        <w:t xml:space="preserve">  experience with comparable commercial real estate / AP automation platforms   (MRI, RealPage, Nexus, Bill.com, or similar).</w:t>
+      </w:r>
+    </w:p>
+    <w:p>
+      <w:pPr>
+        <w:pStyle w:val="ListBullet"/>
+      </w:pPr>
+      <w:r>
+        <w:t xml:space="preserve">Advanced </w:t>
+      </w:r>
+      <w:r>
+        <w:rPr>
+          <w:b/>
+        </w:rPr>
+        <w:t>Excel</w:t>
+      </w:r>
+      <w:r>
+        <w:t xml:space="preserve"> / spreadsheet automation skills.</w:t>
       </w:r>
     </w:p>
     <w:p>
@@ -1032,12 +1174,29 @@
         <w:pStyle w:val="ListBullet"/>
       </w:pPr>
       <w:r>
-        <w:t>Exposure to workflow automation, integrations, or AI-assisted accounting</w:t>
+        <w:t xml:space="preserve">Hands-on experience using </w:t>
+      </w:r>
+      <w:r>
+        <w:rPr>
+          <w:b/>
+        </w:rPr>
+        <w:t>AI tools such as Claude, ChatGPT, or similar</w:t>
+      </w:r>
+      <w:r>
+        <w:t xml:space="preserve"> to</w:t>
       </w:r>
     </w:p>
     <w:p>
       <w:r>
-        <w:t xml:space="preserve">  tools.</w:t>
+        <w:t xml:space="preserve">  work more efficiently — drafting, analysis, summarizing data, or building   simple automations.</w:t>
+      </w:r>
+    </w:p>
+    <w:p>
+      <w:pPr>
+        <w:pStyle w:val="ListBullet"/>
+      </w:pPr>
+      <w:r>
+        <w:t>Exposure to workflow automation and system integrations.</w:t>
       </w:r>
     </w:p>
     <w:p>

</xml_diff>

<commit_message>
Use commensurate-with-experience salary language
</commit_message>
<xml_diff>
--- a/docs/hiring/Korman-Commercial-CPA-Accountant-Job-Description.docx
+++ b/docs/hiring/Korman-Commercial-CPA-Accountant-Job-Description.docx
@@ -1357,16 +1357,16 @@
         <w:pStyle w:val="ListBullet"/>
       </w:pPr>
       <w:r>
-        <w:t xml:space="preserve">Salary: </w:t>
+        <w:t xml:space="preserve">Competitive salary, </w:t>
       </w:r>
       <w:r>
         <w:rPr>
           <w:b/>
         </w:rPr>
-        <w:t>[range TBD]</w:t>
+        <w:t>commensurate with experience and qualifications</w:t>
       </w:r>
       <w:r>
-        <w:t>, commensurate with experience.</w:t>
+        <w:t>.</w:t>
       </w:r>
     </w:p>
     <w:p>

</xml_diff>

<commit_message>
Adopt cleaned draft; add fund & partnership accounting
</commit_message>
<xml_diff>
--- a/docs/hiring/Korman-Commercial-CPA-Accountant-Job-Description.docx
+++ b/docs/hiring/Korman-Commercial-CPA-Accountant-Job-Description.docx
@@ -61,48 +61,7 @@
     </w:p>
     <w:p>
       <w:r>
-        <w:t xml:space="preserve">Korman Commercial Properties is a fifth-generation, family-owned real estate company with more than a century of history building people-first spaces across Pennsylvania and New Jersey. We develop, manage, and lease </w:t>
-      </w:r>
-      <w:r>
-        <w:rPr>
-          <w:b/>
-        </w:rPr>
-        <w:t>commercial office parks, retail shopping centers, and light-industrial / warehouse properties</w:t>
-      </w:r>
-      <w:r>
-        <w:t xml:space="preserve"> throughout the Philadelphia region.</w:t>
-      </w:r>
-    </w:p>
-    <w:p>
-      <w:r>
-        <w:t xml:space="preserve">Behind that portfolio is a group of related legal entities and a central management company — and a lot of accounting that has to stay accurate and current for the whole thing to run smoothly. We run our accounting on </w:t>
-      </w:r>
-      <w:r>
-        <w:rPr>
-          <w:b/>
-        </w:rPr>
-        <w:t>SKYLINE</w:t>
-      </w:r>
-      <w:r>
-        <w:t xml:space="preserve">, automate accounts payable through </w:t>
-      </w:r>
-      <w:r>
-        <w:rPr>
-          <w:b/>
-        </w:rPr>
-        <w:t>AvidXchange</w:t>
-      </w:r>
-      <w:r>
-        <w:t xml:space="preserve">, and live in </w:t>
-      </w:r>
-      <w:r>
-        <w:rPr>
-          <w:b/>
-        </w:rPr>
-        <w:t>Excel</w:t>
-      </w:r>
-      <w:r>
-        <w:t xml:space="preserve"> for analysis and workpapers.</w:t>
+        <w:t>Korman Commercial Properties is a fifth-generation, family-owned real estate company with more than a century of history building people-first spaces across the Philadelphia area. We develop, manage, and lease commercial office parks, retail shopping centers, and residential properties throughout the greater Philadelphia region.</w:t>
       </w:r>
     </w:p>
     <w:p>
@@ -132,12 +91,7 @@
     </w:p>
     <w:p>
       <w:r>
-        <w:t>The right person has commercial real estate and property-management accounting in their bones: they understand clearing accounts, tenant security deposits, operating accounts, inter-entity activity, tenant recoveries/CAM, and the rhythm of monthly close. They're also genuinely comfortable with technology — quick on the computer, eager to adopt better tools, and always looking for a cleaner, faster process rather than defending "the way it's always been done."</w:t>
-      </w:r>
-    </w:p>
-    <w:p>
-      <w:r>
-        <w:t>If you take satisfaction in a tied-out balance sheet, a workpaper that ties to the penny, and books that never fall behind, we'd like to talk to you.</w:t>
+        <w:t>The right person has confidence in commercial real estate and property-management accounting and understands clearing accounts, tenant security deposits, operating accounts, inter-entity activity, tenant recoveries/CAM, and the rhythm of period closings. They're also genuinely comfortable with and embrace technology — quick on the computer, eager to adopt better tools, and always looking for a cleaner, faster process.</w:t>
       </w:r>
     </w:p>
     <w:p>
@@ -283,43 +237,12 @@
         <w:pStyle w:val="ListBullet"/>
       </w:pPr>
       <w:r>
-        <w:t>Reconcile all bank and GL accounts monthly, including:</w:t>
+        <w:t>Reconcile all bank and GL accounts monthly, including operating accounts,</w:t>
       </w:r>
     </w:p>
     <w:p>
-      <w:pPr>
-        <w:pStyle w:val="ListBullet2"/>
-      </w:pPr>
       <w:r>
-        <w:rPr>
-          <w:b/>
-        </w:rPr>
-        <w:t>Operating accounts</w:t>
-      </w:r>
-    </w:p>
-    <w:p>
-      <w:pPr>
-        <w:pStyle w:val="ListBullet2"/>
-      </w:pPr>
-      <w:r>
-        <w:rPr>
-          <w:b/>
-        </w:rPr>
-        <w:t>Tenant security deposit / escrow accounts</w:t>
-      </w:r>
-    </w:p>
-    <w:p>
-      <w:pPr>
-        <w:pStyle w:val="ListBullet2"/>
-      </w:pPr>
-      <w:r>
-        <w:rPr>
-          <w:b/>
-        </w:rPr>
-        <w:t>Clearing accounts</w:t>
-      </w:r>
-      <w:r>
-        <w:t xml:space="preserve"> (and ensuring they clear to zero on schedule)</w:t>
+        <w:t xml:space="preserve">  tenant security deposit / escrow accounts, and clearing accounts.</w:t>
       </w:r>
     </w:p>
     <w:p>
@@ -456,6 +379,109 @@
         <w:rPr>
           <w:color w:val="1F3A5F"/>
         </w:rPr>
+        <w:t>Fund &amp; Partnership Accounting</w:t>
+      </w:r>
+    </w:p>
+    <w:p>
+      <w:pPr>
+        <w:pStyle w:val="ListBullet"/>
+      </w:pPr>
+      <w:r>
+        <w:t xml:space="preserve">Maintain accounting for </w:t>
+      </w:r>
+      <w:r>
+        <w:rPr>
+          <w:b/>
+        </w:rPr>
+        <w:t>properties held in investment funds / partnerships</w:t>
+      </w:r>
+    </w:p>
+    <w:p>
+      <w:r>
+        <w:t xml:space="preserve">  at both the property and fund level.</w:t>
+      </w:r>
+    </w:p>
+    <w:p>
+      <w:pPr>
+        <w:pStyle w:val="ListBullet"/>
+      </w:pPr>
+      <w:r>
+        <w:t xml:space="preserve">Track </w:t>
+      </w:r>
+      <w:r>
+        <w:rPr>
+          <w:b/>
+        </w:rPr>
+        <w:t>partners' / members' capital</w:t>
+      </w:r>
+      <w:r>
+        <w:t xml:space="preserve"> — capital contributions, distributions,</w:t>
+      </w:r>
+    </w:p>
+    <w:p>
+      <w:r>
+        <w:t xml:space="preserve">  and equity roll-forwards by investor.</w:t>
+      </w:r>
+    </w:p>
+    <w:p>
+      <w:pPr>
+        <w:pStyle w:val="ListBullet"/>
+      </w:pPr>
+      <w:r>
+        <w:t xml:space="preserve">Support </w:t>
+      </w:r>
+      <w:r>
+        <w:rPr>
+          <w:b/>
+        </w:rPr>
+        <w:t>allocations of income/loss and distributions</w:t>
+      </w:r>
+      <w:r>
+        <w:t xml:space="preserve"> to investors,</w:t>
+      </w:r>
+    </w:p>
+    <w:p>
+      <w:r>
+        <w:t xml:space="preserve">  including preferred returns where applicable.</w:t>
+      </w:r>
+    </w:p>
+    <w:p>
+      <w:pPr>
+        <w:pStyle w:val="ListBullet"/>
+      </w:pPr>
+      <w:r>
+        <w:t xml:space="preserve">Provide fund-level schedules and reporting to support </w:t>
+      </w:r>
+      <w:r>
+        <w:rPr>
+          <w:b/>
+        </w:rPr>
+      </w:r>
+      <w:r>
+        <w:t>investor reporting and</w:t>
+      </w:r>
+    </w:p>
+    <w:p>
+      <w:r>
+        <w:t xml:space="preserve">  audits</w:t>
+      </w:r>
+      <w:r>
+        <w:rPr>
+          <w:b/>
+        </w:rPr>
+      </w:r>
+      <w:r>
+        <w:t>.</w:t>
+      </w:r>
+    </w:p>
+    <w:p>
+      <w:pPr>
+        <w:pStyle w:val="Heading2"/>
+      </w:pPr>
+      <w:r>
+        <w:rPr>
+          <w:color w:val="1F3A5F"/>
+        </w:rPr>
         <w:t>Inter-Entity Accounting</w:t>
       </w:r>
     </w:p>
@@ -478,7 +504,7 @@
     </w:p>
     <w:p>
       <w:r>
-        <w:t xml:space="preserve">  properties and the management company.</w:t>
+        <w:t xml:space="preserve">  properties, funds, and the management company.</w:t>
       </w:r>
     </w:p>
     <w:p>
@@ -533,15 +559,22 @@
         <w:rPr>
           <w:b/>
         </w:rPr>
-        <w:t>capitalized lease costs</w:t>
       </w:r>
       <w:r>
-        <w:t>, leasehold improvements, and</w:t>
+        <w:t>capitalized lease costs, leasing commissions, and tenant</w:t>
       </w:r>
     </w:p>
     <w:p>
       <w:r>
-        <w:t xml:space="preserve">  tenant improvements.</w:t>
+        <w:t xml:space="preserve">  improvements</w:t>
+      </w:r>
+      <w:r>
+        <w:rPr>
+          <w:b/>
+        </w:rPr>
+      </w:r>
+      <w:r>
+        <w:t>.</w:t>
       </w:r>
     </w:p>
     <w:p>
@@ -596,7 +629,7 @@
         <w:t>a supporting schedule for each balance sheet   account</w:t>
       </w:r>
       <w:r>
-        <w:t xml:space="preserve"> (excluding fixed assets) that </w:t>
+        <w:t xml:space="preserve"> (except fixed assets) that </w:t>
       </w:r>
       <w:r>
         <w:rPr>
@@ -605,7 +638,7 @@
         <w:t>ties to external documentation</w:t>
       </w:r>
       <w:r>
-        <w:t xml:space="preserve">   (bank statements, loan statements, invoices, amortization schedules, etc.).</w:t>
+        <w:t xml:space="preserve"> (bank   statements, loan statements, invoices, amortization schedules, etc.).</w:t>
       </w:r>
     </w:p>
     <w:p>
@@ -700,90 +733,6 @@
     </w:p>
     <w:p>
       <w:pPr>
-        <w:pStyle w:val="ListBullet"/>
-      </w:pPr>
-      <w:r>
-        <w:t>Produce clean, reliable financial statements and supporting reporting for</w:t>
-      </w:r>
-    </w:p>
-    <w:p>
-      <w:r>
-        <w:t xml:space="preserve">  ownership and management.</w:t>
-      </w:r>
-    </w:p>
-    <w:p>
-      <w:pPr>
-        <w:pStyle w:val="Heading2"/>
-      </w:pPr>
-      <w:r>
-        <w:rPr>
-          <w:color w:val="1F3A5F"/>
-        </w:rPr>
-        <w:t>Process &amp; Technology</w:t>
-      </w:r>
-    </w:p>
-    <w:p>
-      <w:pPr>
-        <w:pStyle w:val="ListBullet"/>
-      </w:pPr>
-      <w:r>
-        <w:t xml:space="preserve">Continuously look for ways to </w:t>
-      </w:r>
-      <w:r>
-        <w:rPr>
-          <w:b/>
-        </w:rPr>
-        <w:t>improve, automate, and standardize</w:t>
-      </w:r>
-      <w:r>
-        <w:t xml:space="preserve"> our</w:t>
-      </w:r>
-    </w:p>
-    <w:p>
-      <w:r>
-        <w:t xml:space="preserve">  accounting processes.</w:t>
-      </w:r>
-    </w:p>
-    <w:p>
-      <w:pPr>
-        <w:pStyle w:val="ListBullet"/>
-      </w:pPr>
-      <w:r>
-        <w:t>Adopt and help roll out new tools, integrations, and workflows.</w:t>
-      </w:r>
-    </w:p>
-    <w:p>
-      <w:pPr>
-        <w:pStyle w:val="ListBullet"/>
-      </w:pPr>
-      <w:r>
-        <w:t xml:space="preserve">Use modern tools — including </w:t>
-      </w:r>
-      <w:r>
-        <w:rPr>
-          <w:b/>
-        </w:rPr>
-        <w:t>AI assistants such as Claude or ChatGPT</w:t>
-      </w:r>
-      <w:r>
-        <w:t xml:space="preserve"> —</w:t>
-      </w:r>
-    </w:p>
-    <w:p>
-      <w:r>
-        <w:t xml:space="preserve">  to work faster and reduce manual effort where it makes sense.</w:t>
-      </w:r>
-    </w:p>
-    <w:p>
-      <w:pPr>
-        <w:pStyle w:val="ListBullet"/>
-      </w:pPr>
-      <w:r>
-        <w:t>Document procedures so the close process is repeatable and resilient.</w:t>
-      </w:r>
-    </w:p>
-    <w:p>
-      <w:pPr>
         <w:pStyle w:val="Heading1"/>
       </w:pPr>
       <w:r>
@@ -820,7 +769,7 @@
     </w:p>
     <w:p>
       <w:r>
-        <w:t xml:space="preserve">  Accounting or Finance.</w:t>
+        <w:t xml:space="preserve">  accounting or finance.</w:t>
       </w:r>
     </w:p>
     <w:p>
@@ -849,6 +798,25 @@
       </w:r>
       <w:r>
         <w:t>.</w:t>
+      </w:r>
+    </w:p>
+    <w:p>
+      <w:pPr>
+        <w:pStyle w:val="ListBullet"/>
+      </w:pPr>
+      <w:r>
+        <w:rPr>
+          <w:b/>
+        </w:rPr>
+        <w:t>Fund accounting experience</w:t>
+      </w:r>
+      <w:r>
+        <w:t xml:space="preserve"> — accounting for real estate held in funds /</w:t>
+      </w:r>
+    </w:p>
+    <w:p>
+      <w:r>
+        <w:t xml:space="preserve">  partnerships, including partners' capital, contributions and distributions,   and investor allocations.</w:t>
       </w:r>
     </w:p>
     <w:p>
@@ -991,21 +959,12 @@
         <w:t>Strong technology skills</w:t>
       </w:r>
       <w:r>
-        <w:t xml:space="preserve"> — highly proficient in </w:t>
-      </w:r>
-      <w:r>
-        <w:rPr>
-          <w:b/>
-        </w:rPr>
-        <w:t>Excel</w:t>
-      </w:r>
-      <w:r>
-        <w:t xml:space="preserve"> (pivot tables,</w:t>
+        <w:t xml:space="preserve"> — highly proficient in Excel and comfortable</w:t>
       </w:r>
     </w:p>
     <w:p>
       <w:r>
-        <w:t xml:space="preserve">  lookups, large-workbook analysis) and comfortable learning and adopting new   systems.</w:t>
+        <w:t xml:space="preserve">  learning and adopting new systems.</w:t>
       </w:r>
     </w:p>
     <w:p>
@@ -1019,24 +978,15 @@
         <w:rPr>
           <w:b/>
         </w:rPr>
-        <w:t>SKYLINE</w:t>
+        <w:t>SKYLINE, Yardi</w:t>
       </w:r>
       <w:r>
-        <w:t xml:space="preserve">, </w:t>
-      </w:r>
-      <w:r>
-        <w:rPr>
-          <w:b/>
-        </w:rPr>
-        <w:t>Yardi</w:t>
-      </w:r>
-      <w:r>
-        <w:t>, or a comparable commercial real</w:t>
+        <w:t>, or a comparable commercial real estate</w:t>
       </w:r>
     </w:p>
     <w:p>
       <w:r>
-        <w:t xml:space="preserve">  estate accounting/property management platform, and with an AP automation tool   such as </w:t>
+        <w:t xml:space="preserve">  accounting/property management platform, and with an AP automation tool such   as </w:t>
       </w:r>
       <w:r>
         <w:rPr>
@@ -1077,39 +1027,13 @@
         <w:pStyle w:val="ListBullet"/>
       </w:pPr>
       <w:r>
-        <w:t xml:space="preserve">Direct experience with </w:t>
-      </w:r>
-      <w:r>
         <w:rPr>
           <w:b/>
         </w:rPr>
-        <w:t>SKYLINE</w:t>
+        <w:t>CAM / operating expense reconciliation</w:t>
       </w:r>
       <w:r>
-        <w:t xml:space="preserve">, </w:t>
-      </w:r>
-      <w:r>
-        <w:rPr>
-          <w:b/>
-        </w:rPr>
-        <w:t>Yardi</w:t>
-      </w:r>
-      <w:r>
-        <w:t xml:space="preserve">, and </w:t>
-      </w:r>
-      <w:r>
-        <w:rPr>
-          <w:b/>
-        </w:rPr>
-        <w:t>AvidXchange</w:t>
-      </w:r>
-      <w:r>
-        <w:t>; otherwise</w:t>
-      </w:r>
-    </w:p>
-    <w:p>
-      <w:r>
-        <w:t xml:space="preserve">  experience with comparable commercial real estate / AP automation platforms   (MRI, RealPage, Nexus, Bill.com, or similar).</w:t>
+        <w:t xml:space="preserve"> experience (office, retail).</w:t>
       </w:r>
     </w:p>
     <w:p>
@@ -1117,48 +1041,7 @@
         <w:pStyle w:val="ListBullet"/>
       </w:pPr>
       <w:r>
-        <w:t xml:space="preserve">Advanced </w:t>
-      </w:r>
-      <w:r>
-        <w:rPr>
-          <w:b/>
-        </w:rPr>
-        <w:t>Excel</w:t>
-      </w:r>
-      <w:r>
-        <w:t xml:space="preserve"> / spreadsheet automation skills.</w:t>
-      </w:r>
-    </w:p>
-    <w:p>
-      <w:pPr>
-        <w:pStyle w:val="ListBullet"/>
-      </w:pPr>
-      <w:r>
-        <w:rPr>
-          <w:b/>
-        </w:rPr>
-        <w:t>CAM / operating expense reconciliation</w:t>
-      </w:r>
-      <w:r>
-        <w:t xml:space="preserve"> experience (office, retail, and/or</w:t>
-      </w:r>
-    </w:p>
-    <w:p>
-      <w:r>
-        <w:t xml:space="preserve">  industrial).</w:t>
-      </w:r>
-    </w:p>
-    <w:p>
-      <w:pPr>
-        <w:pStyle w:val="ListBullet"/>
-      </w:pPr>
-      <w:r>
-        <w:t>Advanced spreadsheet skills (pivot tables, lookups, data cleanup) and comfort</w:t>
-      </w:r>
-    </w:p>
-    <w:p>
-      <w:r>
-        <w:t xml:space="preserve">  with automation.</w:t>
+        <w:t>Advanced spreadsheet skills and comfort with automation.</w:t>
       </w:r>
     </w:p>
     <w:p>
@@ -1167,6 +1050,19 @@
       </w:pPr>
       <w:r>
         <w:t>Familiarity with commercial lease terms and tenant recoveries.</w:t>
+      </w:r>
+    </w:p>
+    <w:p>
+      <w:pPr>
+        <w:pStyle w:val="ListBullet"/>
+      </w:pPr>
+      <w:r>
+        <w:t>Fund-level reporting, waterfall/preferred-return calculations, or investor</w:t>
+      </w:r>
+    </w:p>
+    <w:p>
+      <w:r>
+        <w:t xml:space="preserve">  reporting experience.</w:t>
       </w:r>
     </w:p>
     <w:p>
@@ -1300,55 +1196,6 @@
         <w:rPr>
           <w:color w:val="1F3A5F"/>
         </w:rPr>
-        <w:t>Why Korman</w:t>
-      </w:r>
-    </w:p>
-    <w:p>
-      <w:pPr>
-        <w:pStyle w:val="ListBullet"/>
-      </w:pPr>
-      <w:r>
-        <w:t xml:space="preserve">A stable, respected, family-owned company with </w:t>
-      </w:r>
-      <w:r>
-        <w:rPr>
-          <w:b/>
-        </w:rPr>
-        <w:t>100+ years</w:t>
-      </w:r>
-      <w:r>
-        <w:t xml:space="preserve"> in business.</w:t>
-      </w:r>
-    </w:p>
-    <w:p>
-      <w:pPr>
-        <w:pStyle w:val="ListBullet"/>
-      </w:pPr>
-      <w:r>
-        <w:t>A meaningful, high-ownership role where your work directly keeps the portfolio</w:t>
-      </w:r>
-    </w:p>
-    <w:p>
-      <w:r>
-        <w:t xml:space="preserve">  running clean.</w:t>
-      </w:r>
-    </w:p>
-    <w:p>
-      <w:pPr>
-        <w:pStyle w:val="ListBullet"/>
-      </w:pPr>
-      <w:r>
-        <w:t>Room to modernize processes and bring new ideas to how we do accounting.</w:t>
-      </w:r>
-    </w:p>
-    <w:p>
-      <w:pPr>
-        <w:pStyle w:val="Heading1"/>
-      </w:pPr>
-      <w:r>
-        <w:rPr>
-          <w:color w:val="1F3A5F"/>
-        </w:rPr>
         <w:t>Compensation &amp; Benefits</w:t>
       </w:r>
     </w:p>
@@ -1391,7 +1238,7 @@
         <w:rPr>
           <w:i/>
         </w:rPr>
-        <w:t>To apply, send your resume and a brief note about your commercial real estate accounting experience to [contact email].</w:t>
+        <w:t>To apply, send your resume and a brief note about your commercial real estate and fund accounting experience to [contact email].</w:t>
       </w:r>
     </w:p>
     <w:sectPr>

</xml_diff>